<commit_message>
Chapter 2 Haze ENPF version is complete.
</commit_message>
<xml_diff>
--- a/resources/essenceOfStoneWithTOC.docx
+++ b/resources/essenceOfStoneWithTOC.docx
@@ -20332,12 +20332,24 @@
     </w:p>
     <w:p>
       <w:r>
-        <w:t>Agent, Rank One</w:t>
-      </w:r>
-    </w:p>
-    <w:p>
-      <w:r>
-        <w:t>Essence Picker, Class one</w:t>
+        <w:t xml:space="preserve">Agent, </w:t>
+      </w:r>
+      <w:r>
+        <w:t xml:space="preserve">First </w:t>
+      </w:r>
+      <w:r>
+        <w:t>Rank</w:t>
+      </w:r>
+    </w:p>
+    <w:p>
+      <w:r>
+        <w:t xml:space="preserve">Essence Picker, </w:t>
+      </w:r>
+      <w:r>
+        <w:t xml:space="preserve">First </w:t>
+      </w:r>
+      <w:r>
+        <w:t>Class</w:t>
       </w:r>
     </w:p>
     <w:p>

</xml_diff>